<commit_message>
Added Blank Word Document
</commit_message>
<xml_diff>
--- a/Resources/Open_Stance_Preliminary_Project_Plan.docx
+++ b/Resources/Open_Stance_Preliminary_Project_Plan.docx
@@ -4289,6 +4289,7 @@
         </w:tc>
       </w:tr>
     </w:tbl>
+    <w:p/>
     <w:p>
       <w:r>
         <w:t>Daily Perforce workflow: sync/get latest → check out/open for edit → work in Unreal/Rider → organize related files in a pending changelist → review/diff → submit. Binary Unreal assets such as .uasset and .umap should use appropriate locking/exclusive-checkout rules to avoid unmergeable conflicts.</w:t>
@@ -4304,16 +4305,13 @@
         <w:pStyle w:val="Heading1"/>
       </w:pPr>
       <w:r>
+        <w:lastRenderedPageBreak/>
         <w:t>21. Open Design Decisions</w:t>
       </w:r>
     </w:p>
     <w:p>
       <w:r>
-        <w:t xml:space="preserve">The following items are intentionally not finalized: exact right-stick direction mapping; exact scoring/ruleset; precise guard advantages; whether chambering is hold/release or another interaction; final move count; final </w:t>
-      </w:r>
-      <w:r>
-        <w:lastRenderedPageBreak/>
-        <w:t>markerless software; amount of motion warping; whether ragdoll physics is used; exact AI complexity; and the final Major Project 2 schedule.</w:t>
+        <w:t>The following items are intentionally not finalized: exact right-stick direction mapping; exact scoring/ruleset; precise guard advantages; whether chambering is hold/release or another interaction; final move count; final markerless software; amount of motion warping; whether ragdoll physics is used; exact AI complexity; and the final Major Project 2 schedule.</w:t>
       </w:r>
     </w:p>
     <w:sectPr>

</xml_diff>